<commit_message>
Finalize Week 3 public demo documentation
</commit_message>
<xml_diff>
--- a/submit/测试报告.docx
+++ b/submit/测试报告.docx
@@ -5121,7 +5121,7 @@
           <w:rFonts w:ascii="PingFang SC" w:hAnsi="PingFang SC" w:eastAsia="PingFang SC"/>
           <w:sz w:val="21"/>
         </w:rPr>
-        <w:t>容器内正式 RAG 冒烟测试返回 method=faiss_bge_embedding、embedding_model=BAAI/bge-small-zh-v1.5，召回结果保留 source_url、crawl_time 和 data_origin。真实 Agent 调用返回 model_call=true、protocol=responses、model=gpt-5.6-sol，并成功调用 cluster_summary 本地工具。云服务器部署和在线地址仍需在 Render 上完成最终发布。</w:t>
+        <w:t>容器内正式 RAG 冒烟测试返回 method=faiss_bge_embedding、embedding_model=BAAI/bge-small-zh-v1.5，召回结果保留 source_url、crawl_time 和 data_origin。真实 Agent 调用返回 model_call=true、protocol=responses、model=gpt-5.6-sol，并成功调用 cluster_summary 本地工具。2026 年 9 月 20 日通过 Cloudflare Quick Tunnel 提供临时公网演示地址 https://mesa-clip-weight-fleece.trycloudflare.com，实测 HTTP 200。该地址映射到本机 8501 前端，依赖 Docker 与 cloudflared 持续运行，不等同于永久云服务器托管。</w:t>
       </w:r>
     </w:p>
     <w:p>
@@ -5208,7 +5208,7 @@
           <w:rFonts w:ascii="PingFang SC" w:hAnsi="PingFang SC" w:eastAsia="PingFang SC"/>
           <w:sz w:val="21"/>
         </w:rPr>
-        <w:t>Week 3 已完成本地容器验证、测试报告和 AI 使用说明。Render 已作为云端部署目标，但在在线服务成功返回健康检查之前，不把本地地址写成云端演示地址。</w:t>
+        <w:t>Week 3 已完成本地容器验证、测试报告、AI 使用说明和临时公网演示。公网地址是 Cloudflare Quick Tunnel，依赖本机 Docker 与隧道进程持续运行，不等同于永久云服务器托管。</w:t>
       </w:r>
     </w:p>
     <w:sectPr>

</xml_diff>